<commit_message>
Add output specification to md files
</commit_message>
<xml_diff>
--- a/Data Management Resources/RRC_DataManagementPlanTemplate.docx
+++ b/Data Management Resources/RRC_DataManagementPlanTemplate.docx
@@ -2,7 +2,7 @@
 <file path=word/document.xml><?xml version="1.0" encoding="utf-8"?>
 <w:document xmlns:w="http://schemas.openxmlformats.org/wordprocessingml/2006/main" xmlns:m="http://schemas.openxmlformats.org/officeDocument/2006/math" xmlns:r="http://schemas.openxmlformats.org/officeDocument/2006/relationships" xmlns:o="urn:schemas-microsoft-com:office:office" xmlns:v="urn:schemas-microsoft-com:vml" xmlns:w10="urn:schemas-microsoft-com:office:word" xmlns:a="http://schemas.openxmlformats.org/drawingml/2006/main" xmlns:pic="http://schemas.openxmlformats.org/drawingml/2006/picture" xmlns:wp="http://schemas.openxmlformats.org/drawingml/2006/wordprocessingDrawing">
   <w:body>
-    <w:bookmarkStart w:id="49" w:name="data-management-plan-dmp-template"/>
+    <w:bookmarkStart w:id="38" w:name="data-management-plan-dmp-template"/>
     <w:p>
       <w:pPr>
         <w:pStyle w:val="Heading1"/>
@@ -15,7 +15,7 @@
         <w:t xml:space="preserve">Data Management Plan (DMP) Template</w:t>
       </w:r>
     </w:p>
-    <w:bookmarkStart w:id="21" w:name="about-this-document"/>
+    <w:bookmarkStart w:id="10" w:name="about-this-document"/>
     <w:p>
       <w:pPr>
         <w:pStyle w:val="Heading3"/>
@@ -62,7 +62,7 @@
       <w:r>
         <w:t xml:space="preserve"> </w:t>
       </w:r>
-      <w:hyperlink r:id="rId20">
+      <w:hyperlink r:id="rId9">
         <w:r>
           <w:rPr>
             <w:rStyle w:val="Hyperlink"/>
@@ -74,8 +74,8 @@
         <w:t xml:space="preserve">.</w:t>
       </w:r>
     </w:p>
-    <w:bookmarkEnd w:id="21"/>
-    <w:bookmarkStart w:id="23" w:name="data-and-materials-produced"/>
+    <w:bookmarkEnd w:id="10"/>
+    <w:bookmarkStart w:id="12" w:name="data-and-materials-produced"/>
     <w:p>
       <w:pPr>
         <w:pStyle w:val="Heading2"/>
@@ -226,7 +226,7 @@
       <w:r>
         <w:t xml:space="preserve"> </w:t>
       </w:r>
-      <w:hyperlink r:id="rId22">
+      <w:hyperlink r:id="rId11">
         <w:r>
           <w:rPr>
             <w:rStyle w:val="Hyperlink"/>
@@ -241,8 +241,8 @@
         <w:t xml:space="preserve">from EDI, which covers QAQC processes including value checking and data flagging.</w:t>
       </w:r>
     </w:p>
-    <w:bookmarkEnd w:id="23"/>
-    <w:bookmarkStart w:id="29" w:name="standards-formats-and-metadata"/>
+    <w:bookmarkEnd w:id="12"/>
+    <w:bookmarkStart w:id="18" w:name="standards-formats-and-metadata"/>
     <w:p>
       <w:pPr>
         <w:pStyle w:val="Heading2"/>
@@ -333,7 +333,7 @@
       <w:r>
         <w:t xml:space="preserve"> </w:t>
       </w:r>
-      <w:hyperlink r:id="rId24">
+      <w:hyperlink r:id="rId13">
         <w:r>
           <w:rPr>
             <w:rStyle w:val="Hyperlink"/>
@@ -407,7 +407,7 @@
       <w:r>
         <w:t xml:space="preserve"> </w:t>
       </w:r>
-      <w:hyperlink r:id="rId22">
+      <w:hyperlink r:id="rId11">
         <w:r>
           <w:rPr>
             <w:rStyle w:val="Hyperlink"/>
@@ -433,7 +433,7 @@
       <w:r>
         <w:t xml:space="preserve"> </w:t>
       </w:r>
-      <w:hyperlink r:id="rId25">
+      <w:hyperlink r:id="rId14">
         <w:r>
           <w:rPr>
             <w:rStyle w:val="Hyperlink"/>
@@ -450,7 +450,7 @@
       <w:r>
         <w:t xml:space="preserve"> </w:t>
       </w:r>
-      <w:hyperlink r:id="rId26">
+      <w:hyperlink r:id="rId15">
         <w:r>
           <w:rPr>
             <w:rStyle w:val="Hyperlink"/>
@@ -497,7 +497,7 @@
       <w:r>
         <w:t xml:space="preserve"> </w:t>
       </w:r>
-      <w:hyperlink r:id="rId27">
+      <w:hyperlink r:id="rId16">
         <w:r>
           <w:rPr>
             <w:rStyle w:val="Hyperlink"/>
@@ -520,7 +520,7 @@
       <w:r>
         <w:t xml:space="preserve">“</w:t>
       </w:r>
-      <w:hyperlink r:id="rId28">
+      <w:hyperlink r:id="rId17">
         <w:r>
           <w:rPr>
             <w:rStyle w:val="Hyperlink"/>
@@ -538,8 +538,8 @@
         <w:t xml:space="preserve">on your file’s previous versions so that Google does not delete them.</w:t>
       </w:r>
     </w:p>
-    <w:bookmarkEnd w:id="29"/>
-    <w:bookmarkStart w:id="30" w:name="roles-and-responsibilities"/>
+    <w:bookmarkEnd w:id="18"/>
+    <w:bookmarkStart w:id="19" w:name="roles-and-responsibilities"/>
     <w:p>
       <w:pPr>
         <w:pStyle w:val="Heading2"/>
@@ -628,8 +628,8 @@
         <w:t xml:space="preserve">Is any training required to complete specific data collection, analysis, or management tasks?</w:t>
       </w:r>
     </w:p>
-    <w:bookmarkEnd w:id="30"/>
-    <w:bookmarkStart w:id="33" w:name="X5403552cfbbe2a1c055207a869b39669acde908"/>
+    <w:bookmarkEnd w:id="19"/>
+    <w:bookmarkStart w:id="22" w:name="X5403552cfbbe2a1c055207a869b39669acde908"/>
     <w:p>
       <w:pPr>
         <w:pStyle w:val="Heading2"/>
@@ -750,7 +750,7 @@
       <w:r>
         <w:t xml:space="preserve"> </w:t>
       </w:r>
-      <w:hyperlink r:id="rId31">
+      <w:hyperlink r:id="rId20">
         <w:r>
           <w:rPr>
             <w:rStyle w:val="Hyperlink"/>
@@ -827,7 +827,7 @@
       <w:r>
         <w:t xml:space="preserve"> </w:t>
       </w:r>
-      <w:hyperlink r:id="rId32">
+      <w:hyperlink r:id="rId21">
         <w:r>
           <w:rPr>
             <w:rStyle w:val="Hyperlink"/>
@@ -839,8 +839,8 @@
         <w:t xml:space="preserve">.</w:t>
       </w:r>
     </w:p>
-    <w:bookmarkEnd w:id="33"/>
-    <w:bookmarkStart w:id="48" w:name="archiving-storage-and-preservation"/>
+    <w:bookmarkEnd w:id="22"/>
+    <w:bookmarkStart w:id="37" w:name="archiving-storage-and-preservation"/>
     <w:p>
       <w:pPr>
         <w:pStyle w:val="Heading2"/>
@@ -901,7 +901,7 @@
       <w:r>
         <w:t xml:space="preserve"> </w:t>
       </w:r>
-      <w:hyperlink r:id="rId34">
+      <w:hyperlink r:id="rId23">
         <w:r>
           <w:rPr>
             <w:rStyle w:val="Hyperlink"/>
@@ -924,7 +924,7 @@
       <w:r>
         <w:t xml:space="preserve"> </w:t>
       </w:r>
-      <w:hyperlink r:id="rId35">
+      <w:hyperlink r:id="rId24">
         <w:r>
           <w:rPr>
             <w:rStyle w:val="Hyperlink"/>
@@ -1007,7 +1007,7 @@
       <w:r>
         <w:t xml:space="preserve"> </w:t>
       </w:r>
-      <w:hyperlink r:id="rId36">
+      <w:hyperlink r:id="rId25">
         <w:r>
           <w:rPr>
             <w:rStyle w:val="Hyperlink"/>
@@ -1024,7 +1024,7 @@
       <w:r>
         <w:t xml:space="preserve"> </w:t>
       </w:r>
-      <w:hyperlink r:id="rId37">
+      <w:hyperlink r:id="rId26">
         <w:r>
           <w:rPr>
             <w:rStyle w:val="Hyperlink"/>
@@ -1092,7 +1092,7 @@
       <w:r>
         <w:t xml:space="preserve"> </w:t>
       </w:r>
-      <w:hyperlink r:id="rId38">
+      <w:hyperlink r:id="rId27">
         <w:r>
           <w:rPr>
             <w:rStyle w:val="Hyperlink"/>
@@ -1113,7 +1113,7 @@
         <w:t xml:space="preserve">your published data will be reusable.</w:t>
       </w:r>
     </w:p>
-    <w:bookmarkStart w:id="47" w:name="acknowledgements"/>
+    <w:bookmarkStart w:id="36" w:name="acknowledgements"/>
     <w:p>
       <w:pPr>
         <w:pStyle w:val="Heading3"/>
@@ -1136,7 +1136,7 @@
       <w:r>
         <w:t xml:space="preserve"> </w:t>
       </w:r>
-      <w:hyperlink r:id="rId39">
+      <w:hyperlink r:id="rId28">
         <w:r>
           <w:rPr>
             <w:rStyle w:val="Hyperlink"/>
@@ -1156,7 +1156,7 @@
       <w:r>
         <w:t xml:space="preserve"> </w:t>
       </w:r>
-      <w:hyperlink r:id="rId40">
+      <w:hyperlink r:id="rId29">
         <w:r>
           <w:rPr>
             <w:rStyle w:val="Hyperlink"/>
@@ -1176,7 +1176,7 @@
       <w:r>
         <w:t xml:space="preserve"> </w:t>
       </w:r>
-      <w:hyperlink r:id="rId41">
+      <w:hyperlink r:id="rId30">
         <w:r>
           <w:rPr>
             <w:rStyle w:val="Hyperlink"/>
@@ -1190,7 +1190,7 @@
       <w:r>
         <w:t xml:space="preserve"> </w:t>
       </w:r>
-      <w:hyperlink r:id="rId42">
+      <w:hyperlink r:id="rId31">
         <w:r>
           <w:rPr>
             <w:rStyle w:val="Hyperlink"/>
@@ -1204,7 +1204,7 @@
       <w:r>
         <w:t xml:space="preserve"> </w:t>
       </w:r>
-      <w:hyperlink r:id="rId43">
+      <w:hyperlink r:id="rId32">
         <w:r>
           <w:rPr>
             <w:rStyle w:val="Hyperlink"/>
@@ -1218,7 +1218,7 @@
       <w:r>
         <w:t xml:space="preserve"> </w:t>
       </w:r>
-      <w:hyperlink r:id="rId44">
+      <w:hyperlink r:id="rId33">
         <w:r>
           <w:rPr>
             <w:rStyle w:val="Hyperlink"/>
@@ -1232,7 +1232,7 @@
       <w:r>
         <w:t xml:space="preserve"> </w:t>
       </w:r>
-      <w:hyperlink r:id="rId45">
+      <w:hyperlink r:id="rId34">
         <w:r>
           <w:rPr>
             <w:rStyle w:val="Hyperlink"/>
@@ -1246,7 +1246,7 @@
       <w:r>
         <w:t xml:space="preserve"> </w:t>
       </w:r>
-      <w:hyperlink r:id="rId46">
+      <w:hyperlink r:id="rId35">
         <w:r>
           <w:rPr>
             <w:rStyle w:val="Hyperlink"/>
@@ -1261,9 +1261,9 @@
         <w:t xml:space="preserve">are noted throughout the document with direct references to their content.</w:t>
       </w:r>
     </w:p>
-    <w:bookmarkEnd w:id="47"/>
-    <w:bookmarkEnd w:id="48"/>
-    <w:bookmarkEnd w:id="49"/>
+    <w:bookmarkEnd w:id="36"/>
+    <w:bookmarkEnd w:id="37"/>
+    <w:bookmarkEnd w:id="38"/>
     <w:sectPr>
       <w:footnotePr>
         <w:numRestart w:val="eachSect"/>
@@ -1542,10 +1542,10 @@
   <w:docDefaults>
     <w:rPrDefault>
       <w:rPr>
-        <w:rFonts w:asciiTheme="minorHAnsi" w:cstheme="minorBidi" w:eastAsiaTheme="minorHAnsi" w:hAnsiTheme="minorHAnsi"/>
+        <w:rFonts w:asciiTheme="minorHAnsi" w:cstheme="minorBidi" w:eastAsiaTheme="minorEastAsia" w:hAnsiTheme="minorHAnsi"/>
         <w:sz w:val="24"/>
         <w:szCs w:val="24"/>
-        <w:lang w:bidi="ar-SA" w:eastAsia="en-US" w:val="en-US"/>
+        <w:lang w:bidi="ar-SA" w:eastAsia="zh-CN" w:val="en-US"/>
       </w:rPr>
     </w:rPrDefault>
     <w:pPrDefault>
@@ -2086,13 +2086,6 @@
       </w:tblCellMar>
     </w:tblPr>
     <w:tblStylePr w:type="firstRow">
-      <w:tblPr>
-        <w:jc w:val="left"/>
-        <w:tblInd w:type="dxa" w:w="0"/>
-      </w:tblPr>
-      <w:trPr>
-        <w:jc w:val="left"/>
-      </w:trPr>
       <w:tcPr>
         <w:tcBorders>
           <w:bottom w:val="single"/>

</xml_diff>